<commit_message>
fix(slacker): clarify v8 prose — active voice, kill caption dumps
Rewrite chapter_v8 so claims state connections instead of forcing the
reader to assemble list/colon juxtapositions; purge agentless passive;
absorb source cadence; refresh DOCX.

Co-authored-by: Cursor <cursoragent@cursor.com>
</commit_message>
<xml_diff>
--- a/org_frontier/slacker_thirds/chapter/chapter_v8_google_docs.docx
+++ b/org_frontier/slacker_thirds/chapter/chapter_v8_google_docs.docx
@@ -58,7 +58,7 @@
         <w:t xml:space="preserve"> </w:t>
       </w:r>
       <w:r>
-        <w:t xml:space="preserve">follows about a hundred people through one day in Austin. None of them has a continuous story. They talk, leave the frame, and do not return. Most of them never meet one another. The usual account says the camera joins scenes the characters do not join, and never names what the camera does when it joins them.</w:t>
+        <w:t xml:space="preserve">follows roughly a hundred people across one day in Austin. Almost none of them gets a continuous story. A character enters, talks for a stretch, then leaves the frame and does not come back as a continuing subject. Most of these people never meet one another. The day does not gather them into one plot, and the film still holds together for audiences who have no trouble following it. Published accounts of why it holds together usually stop at one claim: the camera joins scenes the characters do not join. That claim names a joiner. It does not say what kind of coordinator a camera is.</w:t>
       </w:r>
     </w:p>
     <w:p>
@@ -66,7 +66,7 @@
         <w:pStyle w:val="BodyText"/>
       </w:pPr>
       <w:r>
-        <w:t xml:space="preserve">A platform is a third that holds people within reach of one another and brokers none of their meetings: when it arranges one, it arranges it impersonally, knowing neither party as a party. People share a relation to something outside them; no broker pairs them. Austin holds the strangers available. The camera selects which stranger the viewer meets next. Markets, firms, and networks do not fit: the people on screen rarely contract, work under one hierarchy, or collaborate, yet the city and the camera still coordinate them. Apps and feeds are later machines built on that form.</w:t>
+        <w:t xml:space="preserve">By a third I mean a coordinating position that is neither of the parties it joins. It is not one of the strangers on screen, and not the viewer either. It is something that holds them in a shared field. A platform, in the sense I use here, is a third that holds people within reach of one another and brokers none of their meetings. When it arranges an encounter, it arranges it impersonally, knowing neither party as a party. People share a relation to something outside them; no broker—no intermediary who knows both sides of a particular pair—pairs them. Austin holds the strangers available. The camera selects which stranger the viewer meets next. Markets, firms, and networks do not fit the footage. The people on screen rarely contract, rarely work under one hierarchy, and rarely collaborate, yet the city and the camera still coordinate them. Apps and feeds are later machines that builders raised on that form, older than the software that now carries the name.</w:t>
       </w:r>
     </w:p>
     <w:p>
@@ -74,7 +74,7 @@
         <w:pStyle w:val="BodyText"/>
       </w:pPr>
       <w:r>
-        <w:t xml:space="preserve">Four writers make different parts of it legible. Simmel names a coordinator with no known pair. Royce explains belonging when people never meet. Reich describes access held as a grant whose reasons can be withheld. Stark and Pais later give the coordinating verb: platforms co-opt, where markets contract, hierarchies command, and networks collaborate.</w:t>
+        <w:t xml:space="preserve">Simmel named the structure of a coordinator that unifies by a common outside relation without knowing which two will meet. Royce named membership when those people never meet face to face. Reich named access that a grantor holds as a grant and whose reasons that grantor can withhold. Stark and Pais later gave the coordinating verb the earlier three lacked. Compress each organizational form into a verb and the contrast is sharp. Markets coordinate by contracting. Hierarchies coordinate by commanding. Networks coordinate by collaborating. Platforms coordinate by co-opting: owners enroll providers and users in the practices of algorithmic management without anyone having delegated managerial authority to them.</w:t>
       </w:r>
       <w:r>
         <w:rPr>
@@ -102,7 +102,7 @@
         <w:t xml:space="preserve"> </w:t>
       </w:r>
       <w:r>
-        <w:t xml:space="preserve">in 1990, after Reich and before Stark and Pais. The structures and powers were already available; digital systems had not yet gathered reach, selection, records, and enrollment into one apparatus.</w:t>
+        <w:t xml:space="preserve">in 1990, after Reich and before Stark and Pais. Simmel, Royce, and Reich had already theorized structure, membership, and grant-access; what digital systems had not yet done was gather reach, selection, permanent records, and enrollment into a single apparatus that issues determinations without a face to answer.</w:t>
       </w:r>
     </w:p>
     <w:p>
@@ -110,7 +110,7 @@
         <w:pStyle w:val="BodyText"/>
       </w:pPr>
       <w:r>
-        <w:t xml:space="preserve">The film does not forecast those systems. It shows the same form unfinished. Read beside later platforms, the parallels are large, and no one shooting in Austin could have known they were filming them; the last section names the skill those systems demand as algorithmacy.</w:t>
+        <w:t xml:space="preserve">The film does not predict Uber or a feed. It records the coordinating form before those machines fused its parts. Beside later platforms, the sidewalk and the cut already show three things platforms still do. A third holds strangers in reach. Something else decides who meets whom next. A grantor can deny access without stating a ground. No one shooting in Austin could have known the later names for those functions. The closing section returns to the competence those later machines demand of people who live inside them, which I call algorithmacy.</w:t>
       </w:r>
     </w:p>
     <w:bookmarkEnd w:id="11"/>
@@ -128,7 +128,7 @@
         <w:pStyle w:val="FirstParagraph"/>
       </w:pPr>
       <w:r>
-        <w:t xml:space="preserve">Without a structural name, the camera’s joins look like style. Simmel’s ordinary thirds will not supply that name, because each acts on a known pair. The non-partisan and the mediator repair a relation between two identified parties. The</w:t>
+        <w:t xml:space="preserve">If the camera’s joins have no structural name, critics will file them as style. They will call the joins an editing trademark, not a coordinating form. Simmel’s ordinary thirds will not supply that name, because each acts on a known pair. The non-partisan and the mediator repair a relation between two identified parties; the</w:t>
       </w:r>
       <w:r>
         <w:t xml:space="preserve"> </w:t>
@@ -141,10 +141,7 @@
         <w:t xml:space="preserve">tertius gaudens</w:t>
       </w:r>
       <w:r>
-        <w:t xml:space="preserve"> </w:t>
-      </w:r>
-      <w:r>
-        <w:t xml:space="preserve">profits from standing between them.</w:t>
+        <w:t xml:space="preserve">, the laughing third, profits from standing between them;</w:t>
       </w:r>
       <w:r>
         <w:t xml:space="preserve"> </w:t>
@@ -154,13 +151,10 @@
           <w:i/>
           <w:iCs/>
         </w:rPr>
-        <w:t xml:space="preserve">Divide et impera</w:t>
-      </w:r>
-      <w:r>
-        <w:t xml:space="preserve"> </w:t>
-      </w:r>
-      <w:r>
-        <w:t xml:space="preserve">sets them against each other in order to rule both.</w:t>
+        <w:t xml:space="preserve">divide et impera</w:t>
+      </w:r>
+      <w:r>
+        <w:t xml:space="preserve">, divide and rule, sets them against each other in order to rule both.</w:t>
       </w:r>
       <w:r>
         <w:rPr>
@@ -172,31 +166,37 @@
         <w:t xml:space="preserve"> </w:t>
       </w:r>
       <w:r>
-        <w:t xml:space="preserve">On the opening page of the same chapter he names a different figure: people drawn together</w:t>
-      </w:r>
-      <w:r>
-        <w:t xml:space="preserve"> </w:t>
-      </w:r>
-      <w:r>
-        <w:t xml:space="preserve">“by their common relation to a phenomenon which lies outside of them,”</w:t>
-      </w:r>
-      <w:r>
-        <w:t xml:space="preserve"> </w:t>
-      </w:r>
-      <w:r>
-        <w:t xml:space="preserve">for example an alliance against a common enemy or the invisible church. He does not analyze it. He says the group-forming mediation of a third element</w:t>
-      </w:r>
-      <w:r>
-        <w:t xml:space="preserve"> </w:t>
-      </w:r>
-      <w:r>
-        <w:t xml:space="preserve">“ist indes in späterem Zusammenhang zu behandeln,”</w:t>
-      </w:r>
-      <w:r>
-        <w:t xml:space="preserve"> </w:t>
-      </w:r>
-      <w:r>
-        <w:t xml:space="preserve">is to be treated in a later context.</w:t>
+        <w:t xml:space="preserve">On the opening page of the same chapter Wolff translates the sentence that matters here:</w:t>
+      </w:r>
+      <w:r>
+        <w:t xml:space="preserve"> </w:t>
+      </w:r>
+      <w:r>
+        <w:t xml:space="preserve">“It is sociologically very significant that isolated elements are unified by their common relation to a phenomenon which lies outside of them.”</w:t>
+      </w:r>
+      <w:r>
+        <w:t xml:space="preserve"> </w:t>
+      </w:r>
+      <w:r>
+        <w:t xml:space="preserve">The examples are an alliance against a common enemy and the invisible church. Then he withholds the analysis.</w:t>
+      </w:r>
+      <w:r>
+        <w:t xml:space="preserve"> </w:t>
+      </w:r>
+      <w:r>
+        <w:t xml:space="preserve">“The group-forming, mediating function of a third element will be discussed in a later context.”</w:t>
+      </w:r>
+      <w:r>
+        <w:t xml:space="preserve"> </w:t>
+      </w:r>
+      <w:r>
+        <w:t xml:space="preserve">In the German:</w:t>
+      </w:r>
+      <w:r>
+        <w:t xml:space="preserve"> </w:t>
+      </w:r>
+      <w:r>
+        <w:t xml:space="preserve">“Diese gesellschaftsbildende Vermittlung eines dritten Elementes ist indes in späterem Zusammenhang zu behandeln.”</w:t>
       </w:r>
       <w:r>
         <w:rPr>
@@ -208,13 +208,19 @@
         <w:t xml:space="preserve"> </w:t>
       </w:r>
       <w:r>
-        <w:t xml:space="preserve">That undeveloped figure is the deferred third: no known pair, no broker. It is the only Simmelian third that matches a cut between strangers who never meet.</w:t>
+        <w:t xml:space="preserve">The reason he gives for setting the case aside is distance: the third stands so far from the other two that there exist no properly sociological interactions which concern all three alike. That undeveloped figure is the deferred third. It has no known pair and no broker who stands between identified parties. It is the only Simmelian third that matches a cut between strangers who never meet.</w:t>
       </w:r>
     </w:p>
     <w:p>
       <w:pPr>
         <w:pStyle w:val="BodyText"/>
       </w:pPr>
+      <w:r>
+        <w:t xml:space="preserve">That deferred third organizes</w:t>
+      </w:r>
+      <w:r>
+        <w:t xml:space="preserve"> </w:t>
+      </w:r>
       <w:r>
         <w:rPr>
           <w:i/>
@@ -226,7 +232,7 @@
         <w:t xml:space="preserve"> </w:t>
       </w:r>
       <w:r>
-        <w:t xml:space="preserve">runs on it. A man off an overnight bus tells a taxi driver about lives he did not choose; the driver does not answer. One cut later, a woman lies in the street, struck, and strangers manage the emergency out loud: calling an ambulance, reaching her son, pressing a card on a witness:</w:t>
+        <w:t xml:space="preserve">from the first cut. A man off an overnight bus rides into Austin telling his taxi driver about the lives he did not choose; the driver never answers. One cut later a woman lies struck in the street, and the strangers who gather manage the emergency out loud, one calling an ambulance, one reaching her son by telephone, one pressing a business card on a witness:</w:t>
       </w:r>
       <w:r>
         <w:t xml:space="preserve"> </w:t>
@@ -244,7 +250,7 @@
         <w:t xml:space="preserve"> </w:t>
       </w:r>
       <w:r>
-        <w:t xml:space="preserve">The offer leads nowhere. He leaves before the police arrive. A bystander says what no one else has said:</w:t>
+        <w:t xml:space="preserve">The offer produces no later meeting. He leaves before the police arrive, and a bystander supplies the fact the scene has withheld:</w:t>
       </w:r>
       <w:r>
         <w:t xml:space="preserve"> </w:t>
@@ -256,7 +262,7 @@
         <w:t xml:space="preserve"> </w:t>
       </w:r>
       <w:r>
-        <w:t xml:space="preserve">Nothing audible connects the taxi to the accident. The two scenes share a day, a city, and a camera. No character brokers them: a broker knows both parties, and neither a sidewalk nor a cut does.</w:t>
+        <w:t xml:space="preserve">Between the taxi and the accident there is no audible link at all. Two strangers who will never learn of each other stand one scene apart; only their common relation to a day, a city, and a camera unifies them. No character brokers them. A broker knows both parties and stands between them; a sidewalk knows nobody, and neither does a cut.</w:t>
       </w:r>
     </w:p>
     <w:p>
@@ -264,7 +270,35 @@
         <w:pStyle w:val="BodyText"/>
       </w:pPr>
       <w:r>
-        <w:t xml:space="preserve">Two functions have to stay distinct or the platform claim collapses. Reach is the environment that holds people where they can summon one another without naming which two will meet: the sidewalk, the city, later the app’s pool of users. Selection is the choice of who comes next for a viewer or a user: the cut, later the feed. The cut selects for a viewer who is party to nothing; the feed selects for the parties themselves. What platforms inherited is the function, not the addressee. The film has both. Reach without brokerage, plus impersonal selection: that is already the platform shape, eighty years after Simmel set the figure aside and thirty years before an app fused the two functions.</w:t>
+        <w:t xml:space="preserve">Analysts must keep reach and selection apart, or</w:t>
+      </w:r>
+      <w:r>
+        <w:t xml:space="preserve"> </w:t>
+      </w:r>
+      <w:r>
+        <w:t xml:space="preserve">“platform”</w:t>
+      </w:r>
+      <w:r>
+        <w:t xml:space="preserve"> </w:t>
+      </w:r>
+      <w:r>
+        <w:t xml:space="preserve">collapses into anything that joins people. Reach is the environment that holds people where they can summon one another without naming which two will meet. In the film that environment is the sidewalk and the city; later it is the app’s pool of users. Selection is the choice of who comes next for a viewer or a user. In the film that choice is the cut; later it is the feed. The cut selects for a viewer who is party to nothing on screen. The feed selects for the parties themselves, assigning a driver or a title to someone inside the system. What platforms inherited is the pairing of those two functions, not the identity of the person for whom selection chooses.</w:t>
+      </w:r>
+      <w:r>
+        <w:t xml:space="preserve"> </w:t>
+      </w:r>
+      <w:r>
+        <w:rPr>
+          <w:i/>
+          <w:iCs/>
+        </w:rPr>
+        <w:t xml:space="preserve">Slacker</w:t>
+      </w:r>
+      <w:r>
+        <w:t xml:space="preserve"> </w:t>
+      </w:r>
+      <w:r>
+        <w:t xml:space="preserve">already has both, and keeps them in separate hands. The city supplies reach. The camera supplies selection. Eighty years after Simmel set the figure aside, and thirty years before an app fused the two functions into one machine, the film already shows the platform shape as a division of labor between city and camera.</w:t>
       </w:r>
     </w:p>
     <w:bookmarkEnd w:id="15"/>
@@ -282,19 +316,16 @@
         <w:pStyle w:val="FirstParagraph"/>
       </w:pPr>
       <w:r>
-        <w:t xml:space="preserve">Simmel’s deferred third joins people without a broker. It does not say what belonging looks like when they never meet. Without that account, a hundred strangers in one day are only a crowd. Royce supplies the missing account. He asked what makes a community and not a crowd. Members need not meet. A community of memory exists when each member</w:t>
-      </w:r>
-      <w:r>
-        <w:t xml:space="preserve"> </w:t>
-      </w:r>
-      <w:r>
-        <w:t xml:space="preserve">“accepts as part of his own individual life and self the same past events that each of his fellow-members accepts.”</w:t>
-      </w:r>
-      <w:r>
-        <w:t xml:space="preserve"> </w:t>
-      </w:r>
-      <w:r>
-        <w:t xml:space="preserve">A community of expectation uses the same relation to shared future events.</w:t>
+        <w:t xml:space="preserve">Simmel’s deferred third explains how a third can join strangers without a broker. It does not explain what belonging looks like when those strangers never meet, and without that account a hundred people in one day remain a crowd, not members of anything. Royce wrote the missing account in 1913. A community of memory, he says, takes shape when each of its members</w:t>
+      </w:r>
+      <w:r>
+        <w:t xml:space="preserve"> </w:t>
+      </w:r>
+      <w:r>
+        <w:t xml:space="preserve">“accepts as part of his own individual life and self the same past events that each of his fellow-members accepts”</w:t>
+      </w:r>
+      <w:r>
+        <w:t xml:space="preserve">; a community of expectation, by the same relation to shared future events.</w:t>
       </w:r>
       <w:r>
         <w:rPr>
@@ -306,7 +337,7 @@
         <w:t xml:space="preserve"> </w:t>
       </w:r>
       <w:r>
-        <w:t xml:space="preserve">Two Maori who each say they came over in the canoe Tai-Nui form a community on that past even if, as Royce adds,</w:t>
+        <w:t xml:space="preserve">His example is two Maori, each of whom says that he came over in the canoe Tai-Nui. They form a community on that past even if, as Royce adds,</w:t>
       </w:r>
       <w:r>
         <w:t xml:space="preserve"> </w:t>
@@ -324,7 +355,7 @@
         <w:t xml:space="preserve"> </w:t>
       </w:r>
       <w:r>
-        <w:t xml:space="preserve">Shared relation to an outside past or future is enough, so with Royce the film’s strangers are members before any platform keeps their record.</w:t>
+        <w:t xml:space="preserve">The present consciousnesses need not interpenetrate. Shared relation to an outside past or future is enough for membership. Under that standard, the film’s strangers are already members of a day and a city before any platform stores their record.</w:t>
       </w:r>
     </w:p>
     <w:p>
@@ -332,7 +363,7 @@
         <w:pStyle w:val="BodyText"/>
       </w:pPr>
       <w:r>
-        <w:t xml:space="preserve">Membership still leaves the camera undertheorized: why should a cut count as coordination and not as editing? Royce held that interpretation takes three terms.</w:t>
+        <w:t xml:space="preserve">Membership alone still leaves the camera undertheorized, because a cut could be mere montage—an aesthetic succession—and not a coordinating act. Royce held that interpretation takes three terms.</w:t>
       </w:r>
       <w:r>
         <w:t xml:space="preserve"> </w:t>
@@ -351,6 +382,12 @@
       </w:r>
       <w:r>
         <w:t xml:space="preserve">“In the technical phrase, interpretation is a triadic relation.”</w:t>
+      </w:r>
+      <w:r>
+        <w:t xml:space="preserve"> </w:t>
+      </w:r>
+      <w:r>
+        <w:t xml:space="preserve">That is, you cannot express any complete process of interpreting by merely naming two terms and then telling what dyadic relation exists between one and the other.</w:t>
       </w:r>
       <w:r>
         <w:rPr>
@@ -362,7 +399,7 @@
         <w:t xml:space="preserve"> </w:t>
       </w:r>
       <w:r>
-        <w:t xml:space="preserve">Two dyads in a row are not a triad.</w:t>
+        <w:t xml:space="preserve">Two dyads laid end to end are not a triad.</w:t>
       </w:r>
       <w:r>
         <w:rPr>
@@ -374,7 +411,7 @@
         <w:t xml:space="preserve"> </w:t>
       </w:r>
       <w:r>
-        <w:t xml:space="preserve">A camera that sequences strangers for a viewer occupies the interpreter’s place. Royce required communication among living members beyond a shared past,</w:t>
+        <w:t xml:space="preserve">A camera that sequences strangers for a viewer occupies the interpreter’s place. It takes one party’s situation as its object and addresses another party, the viewer, with a next encounter. Royce required communication among living members beyond a shared past,</w:t>
       </w:r>
       <w:r>
         <w:rPr>
@@ -398,7 +435,7 @@
         <w:t xml:space="preserve"> </w:t>
       </w:r>
       <w:r>
-        <w:t xml:space="preserve">Reading a camera as interpreter goes beyond him; that move is mine. He gives membership without meeting and does not give a machine interpreter, so the film needs the extension in which the cut does work he reserved for minds.</w:t>
+        <w:t xml:space="preserve">Reading a camera as interpreter therefore goes beyond him; that extension is mine. Royce gives membership without meeting. He does not give a machine that interprets. The film requires the extension, because the cut does work Royce reserved for minds: it selects who comes next for someone who never meets the people on screen.</w:t>
       </w:r>
     </w:p>
     <w:p>
@@ -406,7 +443,7 @@
         <w:pStyle w:val="BodyText"/>
       </w:pPr>
       <w:r>
-        <w:t xml:space="preserve">The film shows a Roycean join the characters do not arrange. In a café a man dictates aphorisms, casting himself as Dostoyevsky and his companion as Anna at work on</w:t>
+        <w:t xml:space="preserve">In a café a man dictates aphorisms, casting himself as Dostoyevsky and his companion as Anna at work on</w:t>
       </w:r>
       <w:r>
         <w:t xml:space="preserve"> </w:t>
@@ -419,7 +456,7 @@
         <w:t xml:space="preserve">The Gambler</w:t>
       </w:r>
       <w:r>
-        <w:t xml:space="preserve">. A passerby asks:</w:t>
+        <w:t xml:space="preserve">, when a passerby breaks in to ask after a friend:</w:t>
       </w:r>
       <w:r>
         <w:t xml:space="preserve"> </w:t>
@@ -431,7 +468,7 @@
         <w:t xml:space="preserve"> </w:t>
       </w:r>
       <w:r>
-        <w:t xml:space="preserve">Nobody has seen Gary for months. The passerby leaves. Somewhere else, another man says he overheard that a friend is missing: one stranger asked, and a different stranger answered. The shared past of Gary missing joins two people who never negotiated a handoff, a join Roycean in form though not yet in depth: neither man has taken Gary’s absence into his own life as Royce’s condition demands. The man who answered then holds his listener through a suppressed moon program and a rain-forest drug that leaves</w:t>
+        <w:t xml:space="preserve">Nobody in the café has seen Gary for months, and the passerby leaves without an answer. A later scene never brings that passerby back. Instead it shows a different man telling a different listener that he overheard someone ask after a missing friend. The film never lets those two men meet, speak, or hand anything across. What joins them for the viewer is only the shared report that Gary is gone. One scene poses the question. Another scene carries news of the same absence. Neither speaker knows the other exists. Neither man meant to join the other, and neither has taken Gary’s absence into his own life as Royce’s condition of appropriation demands. They still stand in a common relation to that reported past. The man who carries the news then holds his listener through a suppressed moon program and a rain-forest drug that leaves</w:t>
       </w:r>
       <w:r>
         <w:t xml:space="preserve"> </w:t>
@@ -443,13 +480,13 @@
         <w:t xml:space="preserve"> </w:t>
       </w:r>
       <w:r>
-        <w:t xml:space="preserve">and does not pass him on. Later he stops a second man (</w:t>
+        <w:t xml:space="preserve">and does not pass him on. Later he stops a second man—</w:t>
       </w:r>
       <w:r>
         <w:t xml:space="preserve">“Just a little security check. There’ve been some people missing”</w:t>
       </w:r>
       <w:r>
-        <w:t xml:space="preserve">) and lets him go:</w:t>
+        <w:t xml:space="preserve">—and lets him go:</w:t>
       </w:r>
       <w:r>
         <w:t xml:space="preserve"> </w:t>
@@ -461,7 +498,7 @@
         <w:t xml:space="preserve"> </w:t>
       </w:r>
       <w:r>
-        <w:t xml:space="preserve">The street made both openings possible and did not choose who would meet whom: reach without selection.</w:t>
+        <w:t xml:space="preserve">The street made both openings possible by holding strangers in reach; it did not choose which of them would meet. Reach supplies the openings. Selection would choose among them. The film has the first and withholds the second.</w:t>
       </w:r>
     </w:p>
     <w:bookmarkEnd w:id="22"/>
@@ -479,7 +516,7 @@
         <w:pStyle w:val="FirstParagraph"/>
       </w:pPr>
       <w:r>
-        <w:t xml:space="preserve">Simmel and Royce give structure and membership. They do not give what a deferred third can do to people who depend on it. Without those powers, the door scenes are local color and today’s licensing pages have no ancestor in the film. When Steve hits the guest list he is priced, evaluated, refused, and left with no ground of argument. Those are the powers: price an exchange, evaluate a party, remove a party, withhold the reason. This four-part reading is mine, taken from the door. Reich named the legal form of the dependence behind it: access held as a grant and not as property, twenty-six years before the film.</w:t>
+        <w:t xml:space="preserve">Structure and membership still leave unexplained what a deferred third can do to people who depend on it for access. Without an account of those powers, the door scenes remain local color and today’s licensing pages have no ancestor in the film. When Steve hits the guest list, the door prices him, evaluates him, refuses him, and leaves him with no ground of argument. I call those four acts the powers of a deferred third over a dependent party. The door can set a price for entry, judge whether a name belongs on the list, put someone out, and refuse to say why. The taxonomy is mine, taken from the door; it is not Reich’s. Reich named the legal form of the dependence behind those powers twenty-six years before the film. A grantor holds access as a grant: that grantor issues permission and can revoke it. The holder does not own access as alienable property.</w:t>
       </w:r>
       <w:r>
         <w:rPr>
@@ -511,19 +548,13 @@
         <w:t xml:space="preserve"> </w:t>
       </w:r>
       <w:r>
-        <w:t xml:space="preserve">Steve spells his name,</w:t>
-      </w:r>
-      <w:r>
-        <w:t xml:space="preserve"> </w:t>
-      </w:r>
-      <w:r>
-        <w:t xml:space="preserve">“S-T-E-V-E. Steve plus three or four,”</w:t>
-      </w:r>
-      <w:r>
-        <w:t xml:space="preserve"> </w:t>
-      </w:r>
-      <w:r>
-        <w:t xml:space="preserve">and the doorman refuses him:</w:t>
+        <w:t xml:space="preserve">Steve spells his name—</w:t>
+      </w:r>
+      <w:r>
+        <w:t xml:space="preserve">“S-T-E-V-E. Steve plus three or four”</w:t>
+      </w:r>
+      <w:r>
+        <w:t xml:space="preserve">—and the doorman refuses him:</w:t>
       </w:r>
       <w:r>
         <w:t xml:space="preserve"> </w:t>
@@ -535,7 +566,7 @@
         <w:t xml:space="preserve"> </w:t>
       </w:r>
       <w:r>
-        <w:t xml:space="preserve">He argues that the band on stage is his roommate’s. The door does not change. Without a reason he cannot contest price, evaluation, or removal, and the fourth power locks the other three.</w:t>
+        <w:t xml:space="preserve">He argues that the band on stage is his roommate’s. The door does not change. Without a stated reason he cannot contest price, evaluation, or removal, which is why withholding the reason locks the other three powers in place.</w:t>
       </w:r>
     </w:p>
     <w:p>
@@ -543,7 +574,7 @@
         <w:pStyle w:val="BodyText"/>
       </w:pPr>
       <w:r>
-        <w:t xml:space="preserve">The door prices; a cover is named at five dollars. It evaluates by checking a name against a list and refusing it. It removes at 2:00 a.m.:</w:t>
+        <w:t xml:space="preserve">The door prices, and names a cover out loud at five dollars. It evaluates by checking a name against a list and refusing it. It removes at 2:00 a.m.:</w:t>
       </w:r>
       <w:r>
         <w:t xml:space="preserve"> </w:t>
@@ -555,7 +586,7 @@
         <w:t xml:space="preserve"> </w:t>
       </w:r>
       <w:r>
-        <w:t xml:space="preserve">It never chooses which two people will meet. Powers attach to a deferred third without making it a broker, and later platforms will do the same when they control access without arranging every meeting.</w:t>
+        <w:t xml:space="preserve">Through all of it the door arranges nothing; it never chooses which two people will meet. Powers can therefore attach to a deferred third without turning that third into a broker. Later platforms do the same when they control access. They price a ride, rate a driver, or remove a title, and still arrange no meeting as a known pair.</w:t>
       </w:r>
     </w:p>
     <w:p>
@@ -563,7 +594,25 @@
         <w:pStyle w:val="BodyText"/>
       </w:pPr>
       <w:r>
-        <w:t xml:space="preserve">Reich also named the shift in how access itself is held, and that shift is what makes the guest list and the stamp two regimes, not two scrapes of local color. Valuables had moved from ownership into grants; the holder faces a counterparty that writes the terms, changes them, decides disputes in its own forum, and owes no procedure.</w:t>
+        <w:t xml:space="preserve">Reich also named the historical shift in how holders hold access itself, and that shift is what makes the guest list and the stamp two regimes of access, not two bits of nightclub business. Valuables had moved from ownership into grants; the holder faces a counterparty that writes the terms, changes them, decides disputes in its own forum, and owes no procedure.</w:t>
+      </w:r>
+      <w:r>
+        <w:t xml:space="preserve"> </w:t>
+      </w:r>
+      <w:r>
+        <w:t xml:space="preserve">“The granting, regulation, and revocation of government largess,”</w:t>
+      </w:r>
+      <w:r>
+        <w:t xml:space="preserve"> </w:t>
+      </w:r>
+      <w:r>
+        <w:t xml:space="preserve">he wrote,</w:t>
+      </w:r>
+      <w:r>
+        <w:t xml:space="preserve"> </w:t>
+      </w:r>
+      <w:r>
+        <w:t xml:space="preserve">“is carried on by procedures which, in varying degrees, represent short-cuts that tend to augment the power of the grantor at the expense of the recipient.”</w:t>
       </w:r>
       <w:r>
         <w:rPr>
@@ -593,13 +642,13 @@
         <w:t xml:space="preserve"> </w:t>
       </w:r>
       <w:r>
-        <w:t xml:space="preserve">Reich wrote that</w:t>
-      </w:r>
-      <w:r>
-        <w:t xml:space="preserve"> </w:t>
-      </w:r>
-      <w:r>
-        <w:t xml:space="preserve">“the denial of any form of privilege or benefit on the basis of undisclosed reasons should no longer be tolerated.”</w:t>
+        <w:t xml:space="preserve">His prescription states the fourth power as a legal demand against denial without disclosed grounds:</w:t>
+      </w:r>
+      <w:r>
+        <w:t xml:space="preserve"> </w:t>
+      </w:r>
+      <w:r>
+        <w:t xml:space="preserve">“The denial of any form of privilege or benefit on the basis of undisclosed reasons should no longer be tolerated.”</w:t>
       </w:r>
       <w:r>
         <w:rPr>
@@ -611,7 +660,7 @@
         <w:t xml:space="preserve"> </w:t>
       </w:r>
       <w:r>
-        <w:t xml:space="preserve">That sentence is the fourth power stated as a legal demand. The film shows both regimes on one night. The guest list is a grant: the grantor keeps the record and can deny without a stated ground.</w:t>
+        <w:t xml:space="preserve">The film shows both regimes on one night. The guest list is a grant. The grantor keeps the record and can deny without a stated ground.</w:t>
       </w:r>
       <w:r>
         <w:t xml:space="preserve"> </w:t>
@@ -635,10 +684,7 @@
         <w:t xml:space="preserve"> </w:t>
       </w:r>
       <w:r>
-        <w:t xml:space="preserve">He shows the transfer:</w:t>
-      </w:r>
-      <w:r>
-        <w:t xml:space="preserve"> </w:t>
+        <w:t xml:space="preserve">He shows the transfer—</w:t>
       </w:r>
       <w:r>
         <w:t xml:space="preserve">“Here, watch. It’s easy. Watch. You just do this,”</w:t>
@@ -663,7 +709,7 @@
         <w:t xml:space="preserve"> </w:t>
       </w:r>
       <w:r>
-        <w:t xml:space="preserve">is [DISC:S5]. At the next door the same group uses it against another five-dollar cover. A stamp can be shown and copied. A grant cannot. Platform life inherits the grant. The stamp is speakable access. Platforms kept the grant and dropped the demonstration. Reich wrote about government. I apply the structure to private doors because that is where the film and later platforms put it.</w:t>
+        <w:t xml:space="preserve">is [DISC:S5]—and at the next door the same group uses it against another five-dollar cover. A holder can show and copy a stamp; nobody can show and copy a grant, because only the grantor’s record can confirm it. Platform life inherits the grant. The stamp is speakable access: you can demonstrate it and hand it on aloud. Platforms kept the grant and dropped that demonstration, so access no longer copies between strangers. Reich wrote about government. I apply the structure to private doors because that is where the film and later platforms locate the same dependence.</w:t>
       </w:r>
       <w:r>
         <w:rPr>
@@ -677,7 +723,17 @@
         <w:pStyle w:val="BodyText"/>
       </w:pPr>
       <w:r>
-        <w:t xml:space="preserve">By 1964 structure, membership, and grant-access were on the page. The coordinating verb was not. The single apparatus that would gather all four powers and remove the face you argue with was not.</w:t>
+        <w:t xml:space="preserve">By 1964, then, writers already had on the page the structure of the deferred third, the membership conditions under it, and the grant form of access. Nobody had yet named the coordinating verb—</w:t>
+      </w:r>
+      <w:r>
+        <w:rPr>
+          <w:i/>
+          <w:iCs/>
+        </w:rPr>
+        <w:t xml:space="preserve">co-opt</w:t>
+      </w:r>
+      <w:r>
+        <w:t xml:space="preserve">—or the single apparatus that would gather all four powers and remove the human face to whom one could still argue. Linklater shot</w:t>
       </w:r>
       <w:r>
         <w:t xml:space="preserve"> </w:t>
@@ -693,7 +749,7 @@
         <w:t xml:space="preserve"> </w:t>
       </w:r>
       <w:r>
-        <w:t xml:space="preserve">was made in that gap.</w:t>
+        <w:t xml:space="preserve">in that historical interval, when people could still speak the form at a door and software had not yet gathered it.</w:t>
       </w:r>
     </w:p>
     <w:bookmarkEnd w:id="28"/>
@@ -711,7 +767,7 @@
         <w:pStyle w:val="FirstParagraph"/>
       </w:pPr>
       <w:r>
-        <w:t xml:space="preserve">Structure, membership, and powers stay abstract until they have a material host. A platform holds people in reach and brokers none of their meetings, so the film can show that form only where strangers are thick on the ground and where work does not already bind them into a firm. If Austin had been a workplace of continuous employment, the soundtrack would be hierarchy and payroll. If it had been a tight housing market, the day would read as bargaining over scarce shelter. The film needs both conditions, reach without employment, or it is the wrong evidence for the interval between Reich and Stark.</w:t>
+        <w:t xml:space="preserve">A platform holds people in reach and brokers none of their meetings, so the film can show that form only where strangers are thick on the ground and where work does not already bind them into a firm. If Austin had been a workplace of continuous employment, the soundtrack would be hierarchy and payroll. If it had been a tight housing market, the day would read as bargaining over scarce shelter. The interval needs both conditions at once: enough reach for strangers to meet, and no employment relation that would already coordinate them. Without that pair, the film would be the wrong evidence between Reich’s grant and Stark and Pais’s verb.</w:t>
       </w:r>
     </w:p>
     <w:p>
@@ -719,7 +775,7 @@
         <w:pStyle w:val="BodyText"/>
       </w:pPr>
       <w:r>
-        <w:t xml:space="preserve">In 1990 Austin had both. I recorded a prediction before the work census: only people staffing coordinating posts would be working: the taxi, the café counter, the door. The count kept the coordinating half and broke the exclusive half. Both coders found paid work in ten of thirty-five segments, including children selling Cokes, a man selling shirts and magazines, a newspaper vendor, a store security supervisor, and two officers at the accident.</w:t>
+        <w:t xml:space="preserve">In 1990 Austin had both. I recorded a prediction before the work census. I expected paid work only at coordinating posts—the taxi, the café counter, and the door—and I expected everyone else to pitch, trade, or refuse work. The count confirmed the coordinating half and refuted the exclusive half. Both coders found paid work in ten of thirty-five segments, including children selling Cokes, a man selling shirts and magazines, a newspaper vendor, a store security supervisor, and two officers at the accident.</w:t>
       </w:r>
       <w:r>
         <w:rPr>
@@ -731,19 +787,13 @@
         <w:t xml:space="preserve"> </w:t>
       </w:r>
       <w:r>
-        <w:t xml:space="preserve">Every audible coordinating post was staffed. The stronger finding was unexpected: across all thirty-five segments, nobody seeks, applies for, or arranges paid work. The only job search is a postcard about a housemate already gone:</w:t>
-      </w:r>
-      <w:r>
-        <w:t xml:space="preserve"> </w:t>
-      </w:r>
-      <w:r>
-        <w:t xml:space="preserve">“So now he’s looking for a job that doesn’t involve much work.”</w:t>
-      </w:r>
-      <w:r>
-        <w:t xml:space="preserve"> </w:t>
-      </w:r>
-      <w:r>
-        <w:t xml:space="preserve">The city coordinates encounter and does not employ the people it holds: a contact surface without payroll.</w:t>
+        <w:t xml:space="preserve">Someone staffs every audible coordinating post. The stronger finding surprised me. Across all thirty-five segments, nobody seeks, applies for, or arranges paid work. The only job search is a postcard about a housemate already gone—</w:t>
+      </w:r>
+      <w:r>
+        <w:t xml:space="preserve">“So now he’s looking for a job that doesn’t involve much work”</w:t>
+      </w:r>
+      <w:r>
+        <w:t xml:space="preserve">—so the city coordinates encounter without employing the people it holds. The day gives strangers a field in which they can meet, and no payroll that would turn those meetings into hierarchical work.</w:t>
       </w:r>
     </w:p>
     <w:p>
@@ -799,7 +849,7 @@
         <w:t xml:space="preserve"> </w:t>
       </w:r>
       <w:r>
-        <w:t xml:space="preserve">so low rent is not the point. Slack is. Slack made a $23,000 shoot possible,</w:t>
+        <w:t xml:space="preserve">which means cheap rent cannot explain the ecology. The figures show surplus vacancy and low production capital relative to the city’s talk and foot traffic—slack, not cheap rent. Slack made a $23,000 shoot possible,</w:t>
       </w:r>
       <w:r>
         <w:rPr>
@@ -823,7 +873,7 @@
         <w:t xml:space="preserve"> </w:t>
       </w:r>
       <w:r>
-        <w:t xml:space="preserve">If people take that filmed past as their own, they meet Royce’s community of memory, and the myth is membership, not the sidewalk and the cut.</w:t>
+        <w:t xml:space="preserve">If later audiences take that filmed past as their own, they meet Royce’s community of memory; the myth then does membership work, but it is not itself the sidewalk or the cut that coordinated the day.</w:t>
       </w:r>
     </w:p>
     <w:p>
@@ -831,7 +881,7 @@
         <w:pStyle w:val="BodyText"/>
       </w:pPr>
       <w:r>
-        <w:t xml:space="preserve">Digital platforms later fuse reach and selection in one apparatus. The film keeps them apart, which is how it teaches the shape of platform sequencing before one machine fused them. Early on, the cut does most of the joining: a question about a missing friend; a report that housemate Paul has vanished, closed with</w:t>
+        <w:t xml:space="preserve">Digital platforms later fuse reach and selection in one apparatus, so a single system both holds users available and chooses who meets whom. The film keeps those functions apart, which is why it can teach the shape of platform sequencing before one machine fused them. Early on, the cut does most of the joining. A question about a missing friend carries the viewer into the next scene. A report that housemate Paul has vanished does the same, and closes with</w:t>
       </w:r>
       <w:r>
         <w:t xml:space="preserve"> </w:t>
@@ -843,7 +893,7 @@
         <w:t xml:space="preserve"> </w:t>
       </w:r>
       <w:r>
-        <w:t xml:space="preserve">In the middle, characters take over with things they can hand over and say aloud: lifts, addresses, a van, a stamp, a camera. By dawn the cut resumes, over a recorded voice and a hail into an empty street.</w:t>
+        <w:t xml:space="preserve">In the middle, characters take over the joins with things they can hand over and say aloud. They offer lifts and addresses. They have a van. They pass a stamp and a camera. By dawn the cut resumes, over a recorded voice and a hail into an empty street.</w:t>
       </w:r>
     </w:p>
     <w:p>
@@ -851,7 +901,7 @@
         <w:pStyle w:val="BodyText"/>
       </w:pPr>
       <w:r>
-        <w:t xml:space="preserve">For each of the thirty-four transitions, two coders asked whether anything audible crosses the seam, and whether an act aimed at another person produces the next encounter (82 percent and 91 percent agreement; κ = 0.75 and 0.84).</w:t>
+        <w:t xml:space="preserve">For each of the thirty-four transitions, two coders asked whether anything audible crosses the seam, and whether an act aimed at another person produces the next encounter, agreeing on 82 percent and 91 percent of cases (Cohen’s κ = 0.75 and 0.84, chance-corrected agreement).</w:t>
       </w:r>
       <w:r>
         <w:rPr>
@@ -875,31 +925,31 @@
         <w:t xml:space="preserve"> </w:t>
       </w:r>
       <w:r>
-        <w:t xml:space="preserve">Of the first fifteen, four or five have a link; of the middle fifteen, eleven do; of the last four, the transcript shows none. Six transitions are deliberate in both codings, and five of those six fall in the middle third. Spoken handoffs:</w:t>
-      </w:r>
-      <w:r>
-        <w:t xml:space="preserve"> </w:t>
-      </w:r>
-      <w:r>
-        <w:t xml:space="preserve">“How about a lift back into town?”</w:t>
-      </w:r>
-      <w:r>
-        <w:t xml:space="preserve"> </w:t>
-      </w:r>
-      <w:r>
-        <w:t xml:space="preserve">“The address, man. Take me there.”</w:t>
-      </w:r>
-      <w:r>
-        <w:t xml:space="preserve"> </w:t>
-      </w:r>
-      <w:r>
-        <w:t xml:space="preserve">“Do I have a car? I have a van.”</w:t>
-      </w:r>
-      <w:r>
-        <w:t xml:space="preserve"> </w:t>
-      </w:r>
-      <w:r>
-        <w:t xml:space="preserve">At the party:</w:t>
+        <w:t xml:space="preserve">Of the first fifteen, four or five have a link; of the middle fifteen, eleven do; of the last four, the transcript shows none. Six transitions are deliberate in both codings, and five of those six fall in the middle third. Spoken handoffs include</w:t>
+      </w:r>
+      <w:r>
+        <w:t xml:space="preserve"> </w:t>
+      </w:r>
+      <w:r>
+        <w:t xml:space="preserve">“How about a lift back into town?,”</w:t>
+      </w:r>
+      <w:r>
+        <w:t xml:space="preserve"> </w:t>
+      </w:r>
+      <w:r>
+        <w:t xml:space="preserve">“The address, man. Take me there,”</w:t>
+      </w:r>
+      <w:r>
+        <w:t xml:space="preserve"> </w:t>
+      </w:r>
+      <w:r>
+        <w:t xml:space="preserve">“Do I have a car? I have a van,”</w:t>
+      </w:r>
+      <w:r>
+        <w:t xml:space="preserve"> </w:t>
+      </w:r>
+      <w:r>
+        <w:t xml:space="preserve">and, at the party,</w:t>
       </w:r>
       <w:r>
         <w:t xml:space="preserve"> </w:t>
@@ -911,7 +961,7 @@
         <w:t xml:space="preserve"> </w:t>
       </w:r>
       <w:r>
-        <w:t xml:space="preserve">When the cut joins scenes, there is nothing to hand over and no one to address. Selection continues while speakability drops, closer to a feed: reach holds from first frame to last, and who does the joining changes.</w:t>
+        <w:t xml:space="preserve">When the cut joins scenes, there is nothing to hand over and no one to address. Selection continues while the handoff becomes unsayable. Reach still holds from first frame to last, but who does the joining shifts from character to cut, and the later stretch already looks like a feed.</w:t>
       </w:r>
     </w:p>
     <w:bookmarkEnd w:id="38"/>
@@ -929,7 +979,7 @@
         <w:pStyle w:val="FirstParagraph"/>
       </w:pPr>
       <w:r>
-        <w:t xml:space="preserve">Simmel, Royce, and Reich still leave a classification problem. If platform coordination is only market, hierarchy, or network, then Steve at the door is a customer, an employee, or a collaborator, and none of those labels fits. Markets contract. Hierarchies command. Networks collaborate. Stark and Pais give a fourth verb: co-opt. Owners enroll providers and users in algorithmic management without delegating managerial authority.</w:t>
+        <w:t xml:space="preserve">If platform coordination were only market, hierarchy, or network, then Steve at the door would be a customer, an employee, or a collaborator, and none of those labels fits what the door does to him. Markets coordinate by contract, hierarchies by command, networks by collaboration. Stark and Pais give a fourth verb: co-opt. In the triangular relationship of owner, provider, and user, platform owners co-opt the behavior of the other two sides, enrolling them in the practices of algorithmic management without anyone having delegated managerial authority to them.</w:t>
       </w:r>
       <w:r>
         <w:rPr>
@@ -941,7 +991,7 @@
         <w:t xml:space="preserve"> </w:t>
       </w:r>
       <w:r>
-        <w:t xml:space="preserve">That classification was missing in 1990, though the enrollment was not.</w:t>
+        <w:t xml:space="preserve">That fourth classification had no named form in 1990; the enrollment it names already showed at the party and at the door.</w:t>
       </w:r>
     </w:p>
     <w:p>
@@ -949,7 +999,7 @@
         <w:pStyle w:val="BodyText"/>
       </w:pPr>
       <w:r>
-        <w:t xml:space="preserve">At the party a PixelVision camera passes hand to hand. People join someone else’s project. They are not hired. Terms are still spoken, and the man who wants the camera back can enforce them. A licensing page keeps the enrollment and drops the person you can argue with. Amazon’s Prime Video page says removed titles</w:t>
+        <w:t xml:space="preserve">At the party a PixelVision camera, a toy video recorder whose tape can pass hand to hand, circulates among strangers. People join someone else’s project without anyone hiring them. They still speak the terms, and the man who wants the camera back can enforce them face to face. A licensing page keeps that same structure of contribution without employment, and removes the person to whom one could argue. Amazon’s Prime Video page says removed titles</w:t>
       </w:r>
       <w:r>
         <w:t xml:space="preserve"> </w:t>
@@ -979,7 +1029,7 @@
         <w:t xml:space="preserve"> </w:t>
       </w:r>
       <w:r>
-        <w:t xml:space="preserve">The verdict arrives; the reasons do not. Prime Video judges live titles on engagement metrics and can remove weak performers. Rideshare Drivers United and the Asian Law Caucus surveyed 810 California drivers: two-thirds reported deactivation; 30 percent of those got no reason.</w:t>
+        <w:t xml:space="preserve">Prime Video issues a determination and withholds its grounds. On algorithmic feedback more generally, Stark and Pais note that parties can deflect and deny accountability. Prime Video judges live titles on engagement metrics and can remove weak performers. Rideshare Drivers United and the Asian Law Caucus surveyed 810 California drivers. Two-thirds reported deactivation, and 30 percent of those received no reason.</w:t>
       </w:r>
       <w:r>
         <w:rPr>
@@ -991,7 +1041,7 @@
         <w:t xml:space="preserve"> </w:t>
       </w:r>
       <w:r>
-        <w:t xml:space="preserve">Same enrollment as the party, with no face left to answer, and no one at that party could have known the later name.</w:t>
+        <w:t xml:space="preserve">Drivers on the app, like people at the party, contribute without being hired. The difference is that the platform has removed the face that could answer, and no one at that party could have known the later institutional name for what they were doing.</w:t>
       </w:r>
     </w:p>
     <w:p>
@@ -999,7 +1049,7 @@
         <w:pStyle w:val="BodyText"/>
       </w:pPr>
       <w:r>
-        <w:t xml:space="preserve">The city’s audible work fits the same verb: coordinating posts are staffed, people held in reach are not on payroll, and the powers price, evaluate, and remove enroll nightlife and attention without hiring.</w:t>
+        <w:t xml:space="preserve">The city’s audible work already co-opts. Someone staffs the coordinating posts. The city holds people in reach without putting them on payroll. The powers that price, evaluate, and remove draw nightlife and attention into the day’s coordination without hiring the people the city holds. People enter the day’s coordination without employment. That is co-optation before anyone used the word.</w:t>
       </w:r>
     </w:p>
     <w:p>
@@ -1007,7 +1057,7 @@
         <w:pStyle w:val="BodyText"/>
       </w:pPr>
       <w:r>
-        <w:t xml:space="preserve">Two limits keep every electronic third from counting as a platform of the</w:t>
+        <w:t xml:space="preserve">Not every electronic third is a platform of the</w:t>
       </w:r>
       <w:r>
         <w:t xml:space="preserve"> </w:t>
@@ -1023,7 +1073,7 @@
         <w:t xml:space="preserve"> </w:t>
       </w:r>
       <w:r>
-        <w:t xml:space="preserve">kind. First, standing between parties is not the power to withhold a reason. In the three years after the film’s release, the interdealer currency market built Reuters Dealing 2000-2 and EBS.</w:t>
+        <w:t xml:space="preserve">kind, because intermediacy alone does not entail the power to withhold a reason. In the three years after the film’s release, the interdealer currency market—screens professional traders use to match one another—built Reuters Dealing 2000-2 and EBS.</w:t>
       </w:r>
       <w:r>
         <w:rPr>
@@ -1035,7 +1085,7 @@
         <w:t xml:space="preserve"> </w:t>
       </w:r>
       <w:r>
-        <w:t xml:space="preserve">Those venues are third parties, not counterparties to the trades.</w:t>
+        <w:t xml:space="preserve">Those venues are third parties in the strict sense, standing between traders without themselves buying or selling; they are not counterparties to the trades.</w:t>
       </w:r>
       <w:r>
         <w:rPr>
@@ -1059,7 +1109,7 @@
         <w:t xml:space="preserve"> </w:t>
       </w:r>
       <w:r>
-        <w:t xml:space="preserve">Dealers also traded directly; the venues do not join people who would otherwise never meet. The same firm can owe written reasons under one rulebook and act in</w:t>
+        <w:t xml:space="preserve">Dealers also traded directly, so the venues do not join people who would otherwise never meet. The same firm can owe written reasons under one rulebook and act in</w:t>
       </w:r>
       <w:r>
         <w:t xml:space="preserve"> </w:t>
@@ -1083,7 +1133,7 @@
         <w:t xml:space="preserve"> </w:t>
       </w:r>
       <w:r>
-        <w:t xml:space="preserve">The four powers attach by rule; digital platforms harden the attachments and do not invent the form.</w:t>
+        <w:t xml:space="preserve">The four powers therefore attach by rule, not by the mere fact of standing between people; digital platforms harden those attachments into default software and do not invent the underlying form.</w:t>
       </w:r>
     </w:p>
     <w:p>
@@ -1091,7 +1141,7 @@
         <w:pStyle w:val="BodyText"/>
       </w:pPr>
       <w:r>
-        <w:t xml:space="preserve">Second, some thirds sit between parties barred from dealing with each other. Formal models ask whether such a third would still be needed if the ban were lifted.</w:t>
+        <w:t xml:space="preserve">Some thirds sit between parties whom the law bars from dealing with each other. Formal models of that case ask a counterfactual: if someone lifted the ban, would coordination still need the third, or would direct dealing replace it?</w:t>
       </w:r>
       <w:r>
         <w:rPr>
@@ -1103,7 +1153,7 @@
         <w:t xml:space="preserve"> </w:t>
       </w:r>
       <w:r>
-        <w:t xml:space="preserve">The deferred third has no such test, because its neighbors were never banned from meeting and simply never met.</w:t>
+        <w:t xml:space="preserve">The deferred third has no such test. Nobody ever banned its neighbors from meeting; they simply never met, which is why the counterfactual that classifies banned-edge intermediaries cannot classify Austin’s sidewalk or the film’s cut.</w:t>
       </w:r>
     </w:p>
     <w:bookmarkEnd w:id="47"/>
@@ -1121,19 +1171,7 @@
         <w:pStyle w:val="FirstParagraph"/>
       </w:pPr>
       <w:r>
-        <w:t xml:space="preserve">Once the form is named, Royce’s further demand still blocks an easy equation of platform and community: loyalty. A platform can meet his memory conditions and fail that demand, because shared logs are not devotion. On screen, people show little devotion to a calling. One man will take a job</w:t>
-      </w:r>
-      <w:r>
-        <w:t xml:space="preserve"> </w:t>
-      </w:r>
-      <w:r>
-        <w:t xml:space="preserve">“when I hear the true call”</w:t>
-      </w:r>
-      <w:r>
-        <w:t xml:space="preserve"> </w:t>
-      </w:r>
-      <w:r>
-        <w:t xml:space="preserve">and will not say what that is. Royce’s memory community needs selves that extend past the present, communication among contemporaries, and shared past events taken as part of each life. A platform meets all three more securely than a city, because it keeps the record. Loyalty makes a shared past</w:t>
+        <w:t xml:space="preserve">Royce’s demand for loyalty blocks any easy equation of platform with community. Loyalty, for him, is devotion that makes a shared past</w:t>
       </w:r>
       <w:r>
         <w:t xml:space="preserve"> </w:t>
@@ -1146,7 +1184,19 @@
         <w:t xml:space="preserve">mine</w:t>
       </w:r>
       <w:r>
-        <w:t xml:space="preserve">, not only true of me. The film’s people share a day and a city without that claim. Users who share logs and ratings they did not author as a common life meet the same conditions: membership without loyalty.</w:t>
+        <w:t xml:space="preserve">. The member owns that past as part of the self. It is not merely a fact that happens to be true of someone. A platform can meet his memory conditions, because it keeps logs of shared past events, and still fail the loyalty demand, because shared logs are not devotion. On screen, people show little devotion to a calling. One man will take a job</w:t>
+      </w:r>
+      <w:r>
+        <w:t xml:space="preserve"> </w:t>
+      </w:r>
+      <w:r>
+        <w:t xml:space="preserve">“when I hear the true call”</w:t>
+      </w:r>
+      <w:r>
+        <w:t xml:space="preserve"> </w:t>
+      </w:r>
+      <w:r>
+        <w:t xml:space="preserve">and will not say what that is. Royce’s memory community needs selves that extend past the present, communication among contemporaries, and shared past events that each member takes as part of a life. A platform meets all three more securely than a city, because it keeps the record permanently. The film’s people share a day and a city without claiming that past as loyalty. Users who share logs and ratings they did not author share a recorded past, not a life they take as their own.</w:t>
       </w:r>
     </w:p>
     <w:p>
@@ -1154,7 +1204,7 @@
         <w:pStyle w:val="BodyText"/>
       </w:pPr>
       <w:r>
-        <w:t xml:space="preserve">Two differences between film and platform show what the record and the automated queue changed. First, custody. The man surrounded by televisions says,</w:t>
+        <w:t xml:space="preserve">The permanent record changes custody. The man surrounded by televisions says,</w:t>
       </w:r>
       <w:r>
         <w:t xml:space="preserve"> </w:t>
@@ -1166,10 +1216,7 @@
         <w:t xml:space="preserve"> </w:t>
       </w:r>
       <w:r>
-        <w:t xml:space="preserve">A driver cannot replay an allocation. The platform keeps the past that members once kept themselves. The film names the problem as rewind. Second, indifference. A guest list fails in public:</w:t>
-      </w:r>
-      <w:r>
-        <w:t xml:space="preserve"> </w:t>
+        <w:t xml:space="preserve">A driver cannot replay an allocation once the queue has moved. The platform keeps the past that members once kept themselves, and the film names that problem as the loss of rewind. Automated assignment changes assent. A guest list fails in public—</w:t>
       </w:r>
       <w:r>
         <w:t xml:space="preserve">“Fuck. I’m not on the list.”</w:t>
@@ -1181,10 +1228,7 @@
         <w:t xml:space="preserve">“Figures.”</w:t>
       </w:r>
       <w:r>
-        <w:t xml:space="preserve"> </w:t>
-      </w:r>
-      <w:r>
-        <w:t xml:space="preserve">The group renegotiates on the sidewalk. An app assigns a queue spot whether or not the driver assents; he stays rateable either way. Membership without assent. Loyalty shows up outside the platform: Rideshare Drivers United and the Asian Law Caucus organized the survey; 810 drivers answered it, and that organization is loyalty against the third, not through it.</w:t>
+        <w:t xml:space="preserve">—and the group renegotiates on the sidewalk, so refusal still requires a spoken response. An app assigns a queue spot whether or not the driver assents; he remains subject to star ratings either way. Membership here does not wait for his yes. Loyalty shows up outside the platform. Rideshare Drivers United and the Asian Law Caucus organized the survey. 810 drivers answered it. That shared work answers a third that will not explain itself.</w:t>
       </w:r>
     </w:p>
     <w:p>
@@ -1192,7 +1236,7 @@
         <w:pStyle w:val="BodyText"/>
       </w:pPr>
       <w:r>
-        <w:t xml:space="preserve">Today’s platforms put into one system what</w:t>
+        <w:t xml:space="preserve">Today’s platforms gather into one system the parts</w:t>
       </w:r>
       <w:r>
         <w:t xml:space="preserve"> </w:t>
@@ -1208,7 +1252,7 @@
         <w:t xml:space="preserve"> </w:t>
       </w:r>
       <w:r>
-        <w:t xml:space="preserve">still keeps separate and speakable: reach and selection, grants and the four powers, enrollment without a face to answer. A scroll of loosely linked units, sequence decided elsewhere, is what a city and a cut were already doing. Place the film between Reich and Stark and the interval does its work: the form was under construction, the record and the automated queue came later, and the literacy required to live inside it is still catching up.</w:t>
+        <w:t xml:space="preserve">still keeps separate and speakable. They fuse reach with selection, hold access as grants backed by the four powers, and enroll people without leaving a face to answer. A scroll of loosely linked units, with something else deciding the sequence elsewhere, is what remains of a city and a cut once people can no longer say the handoffs aloud. Placing the film between Reich and Stark shows grant-access and deferred structure before the later verb, before the fused apparatus, and before the literacy that life inside opaque determinations later requires.</w:t>
       </w:r>
     </w:p>
     <w:bookmarkEnd w:id="48"/>
@@ -1226,7 +1270,7 @@
         <w:pStyle w:val="FirstParagraph"/>
       </w:pPr>
       <w:r>
-        <w:t xml:space="preserve">Naming the form does not name the skill of living in it. I call that skill algorithmacy: fluency in dealing with an algorithmic third that interprets both sides and issues determinations neither side controls.</w:t>
+        <w:t xml:space="preserve">Algorithmacy is the name I give to fluency in dealing with an algorithmic third that interprets both sides and issues determinations neither side controls.</w:t>
       </w:r>
       <w:r>
         <w:rPr>
@@ -1238,7 +1282,7 @@
         <w:t xml:space="preserve"> </w:t>
       </w:r>
       <w:r>
-        <w:t xml:space="preserve">Simmel, Royce, Reich, and Stark and Pais describe the structure, the membership, the grant, and the enrollment. They do not name the competence those arrangements demand once the reasons stop arriving.</w:t>
+        <w:t xml:space="preserve">Simmel, Royce, Reich, and Stark and Pais describe structure, membership, grant-access, and co-optive enrollment. None of them names the competence those arrangements demand of ordinary people once reasons stop arriving with the determinations.</w:t>
       </w:r>
     </w:p>
     <w:p>
@@ -1246,7 +1290,7 @@
         <w:pStyle w:val="BodyText"/>
       </w:pPr>
       <w:r>
-        <w:t xml:space="preserve">Writing is the analogy: fluency lagged the technology by generations.</w:t>
+        <w:t xml:space="preserve">Writing is the historical analogy. Populations did not become fluent with written institutions in the same generation that writing technologies spread; fluency lagged by generations.</w:t>
       </w:r>
       <w:r>
         <w:t xml:space="preserve"> </w:t>
@@ -1262,7 +1306,7 @@
         <w:t xml:space="preserve"> </w:t>
       </w:r>
       <w:r>
-        <w:t xml:space="preserve">is early in that lag for platforms. People on screen still handle thirds they can speak: a cover named aloud, a stamp shown, a list spelled to the person holding it. The camera already works like a feed: next encounter, often with nothing audible crossing the seam. The film knows coordination as something people can argue about at a door. It does not know pricing, evaluation, removal, and withheld reasons gathered into one impersonal apparatus. That split is the lag. Algorithmacy is the fluency the lag demands: living with a third that interprets both sides when the reasons may never come.</w:t>
+        <w:t xml:space="preserve">is early in the corresponding lag for platforms. People on screen still handle thirds they can speak. Someone names a cover aloud. Someone shows a stamp. Someone spells a name to the person holding the list. The camera already works like a feed. The next encounter often arrives with nothing audible crossing the seam. They still know how to argue with a door. They do not yet know how to live inside determinations that arrive without reasons. Algorithmacy names that later fluency. It is how people deal with a third that interprets both sides when the reasons may never come.</w:t>
       </w:r>
     </w:p>
     <w:p>
@@ -1270,7 +1314,7 @@
         <w:pStyle w:val="BodyText"/>
       </w:pPr>
       <w:r>
-        <w:t xml:space="preserve">At the last door the rule is spoken: past two o’clock, everybody out, you gotta be somewhere, you can’t be here. The room empties into the street where people keep talking.</w:t>
+        <w:t xml:space="preserve">At the last door the doorman states the rule out loud and empties the room into the street, where people keep talking.</w:t>
       </w:r>
     </w:p>
     <w:bookmarkEnd w:id="50"/>
@@ -1935,7 +1979,7 @@
         <w:t xml:space="preserve">Sociology</w:t>
       </w:r>
       <w:r>
-        <w:t xml:space="preserve">, 145. The English wording is Wolff’s and I have not been able to verify it against a copy of his translation; the passage is confirmed verbatim against the German original,</w:t>
+        <w:t xml:space="preserve">, 145. Wolff’s wording quoted in the text; the German original is</w:t>
       </w:r>
       <w:r>
         <w:t xml:space="preserve"> </w:t>
@@ -1951,13 +1995,7 @@
         <w:t xml:space="preserve"> </w:t>
       </w:r>
       <w:r>
-        <w:t xml:space="preserve">(Leipzig: Duncker &amp; Humblot, 1908), chap. 2, p. 103, where the deferral reads</w:t>
-      </w:r>
-      <w:r>
-        <w:t xml:space="preserve"> </w:t>
-      </w:r>
-      <w:r>
-        <w:t xml:space="preserve">“Diese gesellschaftsbildende Vermittlung eines dritten Elementes ist indes in späterem Zusammenhang zu behandeln.”</w:t>
+        <w:t xml:space="preserve">(Leipzig: Duncker &amp; Humblot, 1908), chap. 2, p. 103.</w:t>
       </w:r>
       <w:r>
         <w:t xml:space="preserve"> </w:t>
@@ -2253,7 +2291,7 @@
         <w:t xml:space="preserve"> </w:t>
       </w:r>
       <w:r>
-        <w:t xml:space="preserve">73, no. 5 (1964): 733–787.</w:t>
+        <w:t xml:space="preserve">73, no. 5 (1964): 733–787, at 751 for the grantor-power sentence quoted in the text.</w:t>
       </w:r>
     </w:p>
   </w:footnote>

</xml_diff>